<commit_message>
Fixed formatting for final report
</commit_message>
<xml_diff>
--- a/_site/final_report.docx
+++ b/_site/final_report.docx
@@ -1748,6 +1748,9 @@
             <w:pPr>
               <w:pStyle w:val="Compact"/>
             </w:pPr>
+            <w:r>
+              <w:t xml:space="preserve">Github and Quarto website initial setup; Data Preparation and cleaning for usable dataset; Market Baseline analytics; website updates for Home, Introduction, Data Preparation, and Market Baseline; and the final presentation slides</w:t>
+            </w:r>
           </w:p>
         </w:tc>
       </w:tr>
@@ -1769,6 +1772,9 @@
             <w:pPr>
               <w:pStyle w:val="Compact"/>
             </w:pPr>
+            <w:r>
+              <w:t xml:space="preserve">Exploratory Analysis, Skill Gap Analysis, Predictive modleing and heat maps.</w:t>
+            </w:r>
           </w:p>
         </w:tc>
       </w:tr>
@@ -1790,6 +1796,9 @@
             <w:pPr>
               <w:pStyle w:val="Compact"/>
             </w:pPr>
+            <w:r>
+              <w:t xml:space="preserve">Literature Review-Sources and Explanation, Skill Gap Analysis, Exploratory Data Analysis Checks, Final Checks</w:t>
+            </w:r>
           </w:p>
         </w:tc>
       </w:tr>

</xml_diff>